<commit_message>
GGMI June: Laura call → rev2 Meta framing fix + tracker reconciliation
Processed the GGMI-only Laura/Mateus call transcript. Laura's Meta
framing objection was accepted on the call; reframed the deck (no data
rebuild, per Renzo's narrowed scope).

rev2 deck (rev1 preserved, local only, not in Drive):
- Slide 14 headline + highlights: lead with the traffic objective and
  249,972 landing-page visits instead of impressions/CPM; name the $579
  followers campaign as the only awareness effort; drop "upper-funnel".
- Slide 21 appendix framework: move Meta out of the awareness line
  (Quantcast reach only; Meta = "followers only").

Comment-response tracker reconciled to rev2:
- Comment 10: removed the "upper-funnel: reach and site traffic" bullet
  that contradicted the reframe.
- Comment 8: answer now matches the reframed headline; what-we-did
  records the post-call rev2 changes.

Co-Authored-By: Claude Opus 4.8 (1M context) <noreply@anthropic.com>
</commit_message>
<xml_diff>
--- a/report-client-decks/06. GGMI_June_2026-comment-responses.docx
+++ b/report-client-decks/06. GGMI_June_2026-comment-responses.docx
@@ -858,7 +858,7 @@
           <w:color w:val="2B3147"/>
           <w:sz w:val="21"/>
         </w:rPr>
-        <w:t>Added a two-row Meta programs table to the Meta slide: Prospecting/traffic ($25,345) and Engagement/Followers ($579). Grouped, no campaign names, no objective column, so the Followers campaign is no longer mixed with the rest.</w:t>
+        <w:t>Added a two-row Meta programs table to the Meta slide: Prospecting/traffic ($25,345) and Engagement/Followers ($579). Grouped, no campaign names, no objective column, so the Followers campaign is no longer mixed with the rest.  rev2 (post-call) also reframed the slide headline to the traffic objective and its landing-page visits, dropped the impressions/CPM lead, and moved Meta out of the awareness line in the appendix framework.</w:t>
       </w:r>
     </w:p>
     <w:p>
@@ -881,7 +881,7 @@
           <w:color w:val="2B3147"/>
           <w:sz w:val="21"/>
         </w:rPr>
-        <w:t>The Meta slide now separates the programs: Prospecting/traffic and Engagement (Followers). The Followers campaign is no longer combined with the prospecting spend.</w:t>
+        <w:t>The Meta slide now separates the programs: Prospecting/traffic and Engagement (Followers), and leads with the traffic objective (249,972 landing-page visits) rather than impressions or CPM. The Followers campaign is called out as the only awareness effort in June.</w:t>
       </w:r>
     </w:p>
     <w:p>
@@ -1085,7 +1085,7 @@
           <w:color w:val="2B3147"/>
           <w:sz w:val="21"/>
         </w:rPr>
-        <w:t>Meta's June role was upper-funnel: reach and site traffic (6.3M reach, about 1,745 measured sessions).</w:t>
+        <w:t>Meta's June role was a traffic objective: drive landing-page visits and site traffic (249,972 platform landing-page views, 6.3M reach, about 1,745 measured sessions).</w:t>
       </w:r>
     </w:p>
     <w:p>

</xml_diff>